<commit_message>
docs: drop retained Word editions v1.1 and v1.2
Keep only the current Word edition in the repository; earlier editions and
their editorial comments stay available in git history. Update README and
sections 1.4 and 16.1 accordingly and regenerate the v1.3 Word edition.

Co-Authored-By: Claude Fable 5.1 <noreply@anthropic.com>
</commit_message>
<xml_diff>
--- a/docs/MetaScalp_Screener_Specification_v1_3.docx
+++ b/docs/MetaScalp_Screener_Specification_v1_3.docx
@@ -598,7 +598,7 @@
         <w:pStyle w:val="FirstParagraph"/>
       </w:pPr>
       <w:r>
-        <w:t xml:space="preserve">Повторная проверка уточнила контракты реализации, сохранив пять исходных формул, настраиваемые профили и разделение Client и Companion. Исправления внесены в соответствующие разделы; в Word-копиях существенные изменения пояснены редакторскими комментариями рядом с текстом.</w:t>
+        <w:t xml:space="preserve">Повторная проверка уточнила контракты реализации, сохранив пять исходных формул, настраиваемые профили и разделение Client и Companion. Исправления внесены в соответствующие разделы; в Word-копиях редакций 1.1 и 1.2, доступных в истории git, существенные изменения пояснены редакторскими комментариями рядом с текстом.</w:t>
       </w:r>
     </w:p>
     <w:tbl>
@@ -7964,7 +7964,7 @@
         <w:pStyle w:val="FirstParagraph"/>
       </w:pPr>
       <w:r>
-        <w:t xml:space="preserve">docs/specification.md — основной нормативный текст для разработки. Word-копия содержит те же требования, таблицы, примеры и источники; редакторские комментарии Word, если они есть, служат пояснениями и не содержат требований. Копия редакции 1.3 сформирована из Markdown автоматически; предыдущие копии с комментариями сохраняются как исторические. Исходная версия 1.1 сохраняется как историческая. Изменение требований обновляет Markdown, затронутые схемы и Word-копию одной редакцией; расхождение устраняется до её публикации.</w:t>
+        <w:t xml:space="preserve">docs/specification.md — основной нормативный текст для разработки. Word-копия содержит те же требования, таблицы, примеры и источники и формируется из Markdown автоматически; в репозитории хранится только копия текущей редакции, а предыдущие редакции вместе с их редакторскими комментариями доступны в истории git. Изменение требований обновляет Markdown, затронутые схемы и Word-копию одной редакцией; расхождение устраняется до её публикации.</w:t>
       </w:r>
     </w:p>
     <w:p>
@@ -31502,13 +31502,239 @@
       </w:tcPr>
     </w:tblStylePr>
   </w:style>
-  <w:style w:type="paragraph" w:customStyle="1" w:styleId="SourceCode">
+  <w:style w:customStyle="1" w:styleId="SourceCode" w:type="paragraph">
     <w:name w:val="Source Code"/>
     <w:basedOn w:val="Normal"/>
     <w:link w:val="VerbatimChar"/>
     <w:pPr>
       <w:wordWrap w:val="off"/>
     </w:pPr>
+  </w:style>
+  <w:style w:customStyle="1" w:styleId="KeywordTok" w:type="character">
+    <w:name w:val="KeywordTok"/>
+    <w:basedOn w:val="VerbatimChar"/>
+    <w:rPr>
+      <w:b/>
+      <w:color w:val="007020"/>
+    </w:rPr>
+  </w:style>
+  <w:style w:customStyle="1" w:styleId="DataTypeTok" w:type="character">
+    <w:name w:val="DataTypeTok"/>
+    <w:basedOn w:val="VerbatimChar"/>
+    <w:rPr>
+      <w:color w:val="902000"/>
+    </w:rPr>
+  </w:style>
+  <w:style w:customStyle="1" w:styleId="DecValTok" w:type="character">
+    <w:name w:val="DecValTok"/>
+    <w:basedOn w:val="VerbatimChar"/>
+    <w:rPr>
+      <w:color w:val="40a070"/>
+    </w:rPr>
+  </w:style>
+  <w:style w:customStyle="1" w:styleId="BaseNTok" w:type="character">
+    <w:name w:val="BaseNTok"/>
+    <w:basedOn w:val="VerbatimChar"/>
+    <w:rPr>
+      <w:color w:val="40a070"/>
+    </w:rPr>
+  </w:style>
+  <w:style w:customStyle="1" w:styleId="FloatTok" w:type="character">
+    <w:name w:val="FloatTok"/>
+    <w:basedOn w:val="VerbatimChar"/>
+    <w:rPr>
+      <w:color w:val="40a070"/>
+    </w:rPr>
+  </w:style>
+  <w:style w:customStyle="1" w:styleId="ConstantTok" w:type="character">
+    <w:name w:val="ConstantTok"/>
+    <w:basedOn w:val="VerbatimChar"/>
+    <w:rPr>
+      <w:color w:val="880000"/>
+    </w:rPr>
+  </w:style>
+  <w:style w:customStyle="1" w:styleId="CharTok" w:type="character">
+    <w:name w:val="CharTok"/>
+    <w:basedOn w:val="VerbatimChar"/>
+    <w:rPr>
+      <w:color w:val="4070a0"/>
+    </w:rPr>
+  </w:style>
+  <w:style w:customStyle="1" w:styleId="SpecialCharTok" w:type="character">
+    <w:name w:val="SpecialCharTok"/>
+    <w:basedOn w:val="VerbatimChar"/>
+    <w:rPr>
+      <w:color w:val="4070a0"/>
+    </w:rPr>
+  </w:style>
+  <w:style w:customStyle="1" w:styleId="StringTok" w:type="character">
+    <w:name w:val="StringTok"/>
+    <w:basedOn w:val="VerbatimChar"/>
+    <w:rPr>
+      <w:color w:val="4070a0"/>
+    </w:rPr>
+  </w:style>
+  <w:style w:customStyle="1" w:styleId="VerbatimStringTok" w:type="character">
+    <w:name w:val="VerbatimStringTok"/>
+    <w:basedOn w:val="VerbatimChar"/>
+    <w:rPr>
+      <w:color w:val="4070a0"/>
+    </w:rPr>
+  </w:style>
+  <w:style w:customStyle="1" w:styleId="SpecialStringTok" w:type="character">
+    <w:name w:val="SpecialStringTok"/>
+    <w:basedOn w:val="VerbatimChar"/>
+    <w:rPr>
+      <w:color w:val="bb6688"/>
+    </w:rPr>
+  </w:style>
+  <w:style w:customStyle="1" w:styleId="ImportTok" w:type="character">
+    <w:name w:val="ImportTok"/>
+    <w:basedOn w:val="VerbatimChar"/>
+    <w:rPr>
+      <w:b/>
+      <w:color w:val="008000"/>
+    </w:rPr>
+  </w:style>
+  <w:style w:customStyle="1" w:styleId="CommentTok" w:type="character">
+    <w:name w:val="CommentTok"/>
+    <w:basedOn w:val="VerbatimChar"/>
+    <w:rPr>
+      <w:i/>
+      <w:color w:val="60a0b0"/>
+    </w:rPr>
+  </w:style>
+  <w:style w:customStyle="1" w:styleId="DocumentationTok" w:type="character">
+    <w:name w:val="DocumentationTok"/>
+    <w:basedOn w:val="VerbatimChar"/>
+    <w:rPr>
+      <w:i/>
+      <w:color w:val="ba2121"/>
+    </w:rPr>
+  </w:style>
+  <w:style w:customStyle="1" w:styleId="AnnotationTok" w:type="character">
+    <w:name w:val="AnnotationTok"/>
+    <w:basedOn w:val="VerbatimChar"/>
+    <w:rPr>
+      <w:b/>
+      <w:i/>
+      <w:color w:val="60a0b0"/>
+    </w:rPr>
+  </w:style>
+  <w:style w:customStyle="1" w:styleId="CommentVarTok" w:type="character">
+    <w:name w:val="CommentVarTok"/>
+    <w:basedOn w:val="VerbatimChar"/>
+    <w:rPr>
+      <w:b/>
+      <w:i/>
+      <w:color w:val="60a0b0"/>
+    </w:rPr>
+  </w:style>
+  <w:style w:customStyle="1" w:styleId="OtherTok" w:type="character">
+    <w:name w:val="OtherTok"/>
+    <w:basedOn w:val="VerbatimChar"/>
+    <w:rPr>
+      <w:color w:val="007020"/>
+    </w:rPr>
+  </w:style>
+  <w:style w:customStyle="1" w:styleId="FunctionTok" w:type="character">
+    <w:name w:val="FunctionTok"/>
+    <w:basedOn w:val="VerbatimChar"/>
+    <w:rPr>
+      <w:color w:val="06287e"/>
+    </w:rPr>
+  </w:style>
+  <w:style w:customStyle="1" w:styleId="VariableTok" w:type="character">
+    <w:name w:val="VariableTok"/>
+    <w:basedOn w:val="VerbatimChar"/>
+    <w:rPr>
+      <w:color w:val="19177c"/>
+    </w:rPr>
+  </w:style>
+  <w:style w:customStyle="1" w:styleId="ControlFlowTok" w:type="character">
+    <w:name w:val="ControlFlowTok"/>
+    <w:basedOn w:val="VerbatimChar"/>
+    <w:rPr>
+      <w:b/>
+      <w:color w:val="007020"/>
+    </w:rPr>
+  </w:style>
+  <w:style w:customStyle="1" w:styleId="OperatorTok" w:type="character">
+    <w:name w:val="OperatorTok"/>
+    <w:basedOn w:val="VerbatimChar"/>
+    <w:rPr>
+      <w:color w:val="666666"/>
+    </w:rPr>
+  </w:style>
+  <w:style w:customStyle="1" w:styleId="BuiltInTok" w:type="character">
+    <w:name w:val="BuiltInTok"/>
+    <w:basedOn w:val="VerbatimChar"/>
+    <w:rPr>
+      <w:color w:val="008000"/>
+    </w:rPr>
+  </w:style>
+  <w:style w:customStyle="1" w:styleId="ExtensionTok" w:type="character">
+    <w:name w:val="ExtensionTok"/>
+    <w:basedOn w:val="VerbatimChar"/>
+    <w:rPr/>
+  </w:style>
+  <w:style w:customStyle="1" w:styleId="PreprocessorTok" w:type="character">
+    <w:name w:val="PreprocessorTok"/>
+    <w:basedOn w:val="VerbatimChar"/>
+    <w:rPr>
+      <w:color w:val="bc7a00"/>
+    </w:rPr>
+  </w:style>
+  <w:style w:customStyle="1" w:styleId="AttributeTok" w:type="character">
+    <w:name w:val="AttributeTok"/>
+    <w:basedOn w:val="VerbatimChar"/>
+    <w:rPr>
+      <w:color w:val="7d9029"/>
+    </w:rPr>
+  </w:style>
+  <w:style w:customStyle="1" w:styleId="RegionMarkerTok" w:type="character">
+    <w:name w:val="RegionMarkerTok"/>
+    <w:basedOn w:val="VerbatimChar"/>
+    <w:rPr/>
+  </w:style>
+  <w:style w:customStyle="1" w:styleId="InformationTok" w:type="character">
+    <w:name w:val="InformationTok"/>
+    <w:basedOn w:val="VerbatimChar"/>
+    <w:rPr>
+      <w:b/>
+      <w:i/>
+      <w:color w:val="60a0b0"/>
+    </w:rPr>
+  </w:style>
+  <w:style w:customStyle="1" w:styleId="WarningTok" w:type="character">
+    <w:name w:val="WarningTok"/>
+    <w:basedOn w:val="VerbatimChar"/>
+    <w:rPr>
+      <w:b/>
+      <w:i/>
+      <w:color w:val="60a0b0"/>
+    </w:rPr>
+  </w:style>
+  <w:style w:customStyle="1" w:styleId="AlertTok" w:type="character">
+    <w:name w:val="AlertTok"/>
+    <w:basedOn w:val="VerbatimChar"/>
+    <w:rPr>
+      <w:b/>
+      <w:color w:val="ff0000"/>
+    </w:rPr>
+  </w:style>
+  <w:style w:customStyle="1" w:styleId="ErrorTok" w:type="character">
+    <w:name w:val="ErrorTok"/>
+    <w:basedOn w:val="VerbatimChar"/>
+    <w:rPr>
+      <w:b/>
+      <w:color w:val="ff0000"/>
+    </w:rPr>
+  </w:style>
+  <w:style w:customStyle="1" w:styleId="NormalTok" w:type="character">
+    <w:name w:val="NormalTok"/>
+    <w:basedOn w:val="VerbatimChar"/>
+    <w:rPr/>
   </w:style>
   <w:style w:type="character" w:customStyle="1" w:styleId="KeywordTok">
     <w:name w:val="KeywordTok"/>

</xml_diff>